<commit_message>
Correct product format: cartridge → sachet (immersion in oil)
- Patent: rewrite all 16 claims for sachet construction (heat-resistant
  pouch, granulated MMT 0.3-0.5mm, immersion usage 15-30min)
- Manuscript: rewrite narrative from gravity-flow cartridge to consumer
  immersion sachet; fix Highlights ≤85 chars; fix PPTX font sizing for
  all paragraphs; unify cost basis at 300-500 JPY/kg
- Product design: sachet format CLAYPOT (80x100mm tea-bag, ¥498/3pcs),
  not cartridge
- Roadmap: update all references from cartridge to sachet format

Co-Authored-By: Tatsuki Onishi <bougtoir@gmail.com>
</commit_message>
<xml_diff>
--- a/montmorillonite_oil/manuscript_tifs_commentary.docx
+++ b/montmorillonite_oil/manuscript_tifs_commentary.docx
@@ -11,7 +11,7 @@
           <w:b/>
           <w:sz w:val="28"/>
         </w:rPr>
-        <w:t>From plant to pot: Acid-activated montmorillonite cartridge filters as a consumer-side cooking oil restoration paradigm</w:t>
+        <w:t>From plant to pot: Acid-activated montmorillonite sachets as a consumer-side cooking oil restoration paradigm</w:t>
       </w:r>
     </w:p>
     <w:p/>
@@ -32,7 +32,7 @@
         <w:rPr>
           <w:sz w:val="20"/>
         </w:rPr>
-        <w:t>Bleaching earth (acid-activated montmorillonite) is the industrial standard for edible oil refining</w:t>
+        <w:t>Bleaching earth is the industrial standard for edible oil refining</w:t>
       </w:r>
     </w:p>
     <w:p>
@@ -43,7 +43,7 @@
         <w:rPr>
           <w:sz w:val="20"/>
         </w:rPr>
-        <w:t>Consumer oil pots use only physical filters with no chemical purification capability</w:t>
+        <w:t>Consumer oil pots lack chemical purification capability</w:t>
       </w:r>
     </w:p>
     <w:p>
@@ -54,7 +54,7 @@
         <w:rPr>
           <w:sz w:val="20"/>
         </w:rPr>
-        <w:t>MMT cartridge filters selectively adsorb polar degradation products while retaining triglycerides</w:t>
+        <w:t>MMT sachets selectively adsorb polar degradation products</w:t>
       </w:r>
     </w:p>
     <w:p>
@@ -65,7 +65,7 @@
         <w:rPr>
           <w:sz w:val="20"/>
         </w:rPr>
-        <w:t>Projected acid value reduction of 30-50% and polar compound reduction of 20-40% per pass</w:t>
+        <w:t>Projected acid value reduction of 30-50% per immersion</w:t>
       </w:r>
     </w:p>
     <w:p>
@@ -76,7 +76,7 @@
         <w:rPr>
           <w:sz w:val="20"/>
         </w:rPr>
-        <w:t>Existing oil pot infrastructure enables immediate consumer adoption without new equipment</w:t>
+        <w:t>Existing sachet manufacturing enables immediate adoption</w:t>
       </w:r>
     </w:p>
     <w:p/>
@@ -88,7 +88,7 @@
         <w:t xml:space="preserve">Keywords: </w:t>
       </w:r>
       <w:r>
-        <w:t>Montmorillonite; Bleaching earth; Cooking oil restoration; Acid-activated clay; Oil pot filter; Selective adsorption</w:t>
+        <w:t>Montmorillonite; Bleaching earth; Cooking oil restoration; Acid-activated clay; Sachet; Selective adsorption</w:t>
       </w:r>
     </w:p>
     <w:p/>
@@ -103,7 +103,7 @@
     </w:p>
     <w:p>
       <w:r>
-        <w:t>The global practice of reusing cooking oil after deep-frying generates chemically degraded oil containing elevated levels of free fatty acids (FFA), polar compounds, peroxides, and polymeric triglycerides. While industrial edible oil refining has relied on acid-activated montmorillonite (bleaching earth) for selective removal of polar degradation products for over a century, this proven technology has never been translated to the consumer setting. Current household oil pots employ paper or activated carbon filters that provide only physical filtration of particulates, with negligible chemical purification. This Commentary proposes a paradigm shift: cartridge-format filters containing granulated acid-activated montmorillonite, compatible with existing oil pots, that selectively adsorb polar degradation products while retaining triglycerides. Drawing on industrial bleaching earth performance data and the established food-safety profile of bentonite (FDA GRAS 21 CFR 184.1155; EU E558), we project acid value reductions of 30-50% and total polar compound reductions of 20-40% per filtration pass at recommended temperatures (50-100 C). This approach could extend cooking oil lifespan 2-3 fold, reducing household food waste and oil purchasing costs. Manufacturing infrastructure already exists in both the bleaching earth and oil pot filter industries, making near-term commercialization feasible.</w:t>
+        <w:t>The global practice of reusing cooking oil after deep-frying generates chemically degraded oil containing elevated levels of free fatty acids (FFA), polar compounds, peroxides, and polymeric triglycerides. While industrial edible oil refining has relied on acid-activated montmorillonite (bleaching earth) for selective removal of polar degradation products for over a century, this proven technology has never been translated to the consumer setting. Current household oil pots employ paper or activated carbon filters that provide only physical filtration of particulates, with negligible chemical purification. This Commentary proposes a paradigm shift: sachets (tea-bag format) containing granulated acid-activated montmorillonite that are immersed in used cooking oil to selectively adsorb polar degradation products while retaining triglycerides. Drawing on industrial bleaching earth performance data and the established food-safety profile of bentonite (FDA GRAS 21 CFR 184.1155; EU E558), we project acid value reductions of 30-50% and total polar compound reductions of 20-40% per 20-minute immersion at recommended temperatures (50-80 C). This approach could extend cooking oil lifespan 2-3 fold, reducing household food waste and oil purchasing costs. Manufacturing infrastructure already exists in both the bleaching earth and tea-bag/filter sachet industries, making near-term commercialization feasible.</w:t>
       </w:r>
     </w:p>
     <w:p/>
@@ -390,7 +390,7 @@
         <w:rPr>
           <w:sz w:val="20"/>
         </w:rPr>
-        <w:t>Comparison of consumer oil pot filter technologies.</w:t>
+        <w:t>Comparison of consumer oil treatment technologies.</w:t>
       </w:r>
     </w:p>
     <w:tbl>
@@ -727,7 +727,7 @@
                 <w:b w:val="0"/>
                 <w:sz w:val="18"/>
               </w:rPr>
-              <w:t>MMT cartridge (proposed)</w:t>
+              <w:t>MMT sachet (proposed)</w:t>
             </w:r>
           </w:p>
         </w:tc>
@@ -787,7 +787,7 @@
                 <w:b w:val="0"/>
                 <w:sz w:val="18"/>
               </w:rPr>
-              <w:t>&gt;96%</w:t>
+              <w:t>&gt;95%</w:t>
             </w:r>
           </w:p>
         </w:tc>
@@ -849,7 +849,7 @@
         <w:rPr>
           <w:sz w:val="22"/>
         </w:rPr>
-        <w:t>We propose that acid-activated montmorillonite can be formatted as replaceable cartridge filters compatible with existing oil pots, enabling consumer-side chemical restoration of used cooking oil. This represents a shift from physical filtration (particle removal) to chemical restoration (selective adsorption of polar degradation products) (Fig. 1).</w:t>
+        <w:t>We propose that acid-activated montmorillonite can be formatted as immersion sachets -- analogous to tea bags -- that are placed directly into used cooking oil to selectively adsorb polar degradation products. This represents a shift from physical filtration (particle removal) to chemical restoration (selective adsorption) (Fig. 1).</w:t>
       </w:r>
     </w:p>
     <w:p>
@@ -868,7 +868,7 @@
           <w:i/>
           <w:sz w:val="20"/>
         </w:rPr>
-        <w:t>Schematic comparison of industrial bleaching earth process (left: powder slurry, mechanical agitation, centrifugal separation) and proposed consumer cartridge format (right: granulated MMT, gravity flow-through, drop-in oil pot cartridge). The polarity-based selectivity mechanism is conserved across both formats.</w:t>
+        <w:t>Schematic comparison of industrial bleaching earth process (left: powder slurry, mechanical agitation, centrifugal separation) and proposed consumer sachet format (right: granulated MMT in tea-bag sachet, immersed in used oil, removed after treatment). The polarity-based selectivity mechanism is conserved across both formats.</w:t>
       </w:r>
     </w:p>
     <w:p>
@@ -881,7 +881,7 @@
         <w:rPr>
           <w:sz w:val="22"/>
         </w:rPr>
-        <w:t>The key technical adaptations required for this translation are: (i) granulation of bleaching earth to 0.8-1.5 mm particles (vs. industrial powder &lt;0.1 mm) to enable gravity-flow filtration without particle shedding; (ii) heat-resistant cartridge construction (stainless steel mesh + heat-resistant nonwoven) compatible with oil temperatures up to 180 C; (iii) cartridge geometry matching standard oil pot dimensions (70-120 mm diameter); and (iv) consumer-friendly quality indicators for cartridge replacement timing.</w:t>
+        <w:t>The key technical adaptations required for this translation are: (i) granulation of bleaching earth to 0.3-0.5 mm particles (vs. industrial powder &lt;0.1 mm) to prevent particle shedding through the sachet membrane while maintaining adequate surface area; (ii) heat-resistant sachet construction (PP or PTFE nonwoven, heat-sealed) tolerant of oil temperatures up to 180 C; (iii) extended immersion time (15-30 min vs. beverage sachets' 3-5 min) to compensate for the high viscosity of cooking oil (40-80x water); and (iv) consumer-friendly quality indicators for assessing oil improvement.</w:t>
       </w:r>
     </w:p>
     <w:p>
@@ -920,6 +920,14 @@
     <w:p>
       <w:r>
         <w:rPr>
+          <w:sz w:val="22"/>
+        </w:rPr>
+        <w:t>Notably, the sachet format mirrors our parallel proposal for montmorillonite-based portable decaffeination sachets, where the same mineral's selective adsorption properties are exploited to remove caffeine from beverages while retaining polyphenols. The oil restoration sachet extends this consumer-side paradigm to a second major food processing application.</w:t>
+      </w:r>
+    </w:p>
+    <w:p>
+      <w:r>
+        <w:rPr>
           <w:b/>
           <w:sz w:val="24"/>
         </w:rPr>
@@ -931,7 +939,7 @@
         <w:rPr>
           <w:sz w:val="22"/>
         </w:rPr>
-        <w:t>Based on industrial bleaching earth performance data and bench-scale column adsorption studies,</w:t>
+        <w:t>Based on industrial bleaching earth performance data and bench-scale adsorption studies,</w:t>
       </w:r>
       <w:r>
         <w:rPr>
@@ -944,7 +952,7 @@
         <w:rPr>
           <w:sz w:val="22"/>
         </w:rPr>
-        <w:t xml:space="preserve"> we project the following performance for a 30 g acid-activated montmorillonite cartridge processing 500 mL of used cooking oil at 80 C (Table 2).</w:t>
+        <w:t xml:space="preserve"> we project the following performance for a 25 g acid-activated montmorillonite sachet immersed in 500 mL of used cooking oil at 80 C for 20 minutes (Table 2).</w:t>
       </w:r>
     </w:p>
     <w:p>
@@ -962,7 +970,7 @@
         <w:rPr>
           <w:sz w:val="20"/>
         </w:rPr>
-        <w:t>Projected performance specifications for a montmorillonite oil restoration cartridge.</w:t>
+        <w:t>Projected performance specifications for a montmorillonite oil restoration sachet.</w:t>
       </w:r>
     </w:p>
     <w:tbl>
@@ -1020,7 +1028,7 @@
                 <w:b w:val="0"/>
                 <w:sz w:val="18"/>
               </w:rPr>
-              <w:t>Cartridge fill</w:t>
+              <w:t>Sachet fill</w:t>
             </w:r>
           </w:p>
         </w:tc>
@@ -1035,7 +1043,7 @@
                 <w:b w:val="0"/>
                 <w:sz w:val="18"/>
               </w:rPr>
-              <w:t>30 g acid-activated MMT (0.8-1.5 mm)</w:t>
+              <w:t>25 g acid-activated MMT (0.3-0.5 mm)</w:t>
             </w:r>
           </w:p>
         </w:tc>
@@ -1052,7 +1060,7 @@
                 <w:b w:val="0"/>
                 <w:sz w:val="18"/>
               </w:rPr>
-              <w:t>Oil volume per pass</w:t>
+              <w:t>Oil volume</w:t>
             </w:r>
           </w:p>
         </w:tc>
@@ -1084,7 +1092,7 @@
                 <w:b w:val="0"/>
                 <w:sz w:val="18"/>
               </w:rPr>
-              <w:t>Filtration temperature</w:t>
+              <w:t>Immersion temperature</w:t>
             </w:r>
           </w:p>
         </w:tc>
@@ -1099,7 +1107,7 @@
                 <w:b w:val="0"/>
                 <w:sz w:val="18"/>
               </w:rPr>
-              <w:t>50-100 C (recommended 80 C)</w:t>
+              <w:t>50-80 C (recommended 80 C)</w:t>
             </w:r>
           </w:p>
         </w:tc>
@@ -1116,7 +1124,7 @@
                 <w:b w:val="0"/>
                 <w:sz w:val="18"/>
               </w:rPr>
-              <w:t>Flow time</w:t>
+              <w:t>Immersion time</w:t>
             </w:r>
           </w:p>
         </w:tc>
@@ -1131,7 +1139,7 @@
                 <w:b w:val="0"/>
                 <w:sz w:val="18"/>
               </w:rPr>
-              <w:t>2-5 min (gravity)</w:t>
+              <w:t>15-30 min</w:t>
             </w:r>
           </w:p>
         </w:tc>
@@ -1163,7 +1171,7 @@
                 <w:b w:val="0"/>
                 <w:sz w:val="18"/>
               </w:rPr>
-              <w:t>30-50% per pass</w:t>
+              <w:t>30-50% per immersion</w:t>
             </w:r>
           </w:p>
         </w:tc>
@@ -1195,7 +1203,7 @@
                 <w:b w:val="0"/>
                 <w:sz w:val="18"/>
               </w:rPr>
-              <w:t>20-40% per pass</w:t>
+              <w:t>20-40% per immersion</w:t>
             </w:r>
           </w:p>
         </w:tc>
@@ -1227,7 +1235,7 @@
                 <w:b w:val="0"/>
                 <w:sz w:val="18"/>
               </w:rPr>
-              <w:t>40-70% per pass</w:t>
+              <w:t>40-70% per immersion</w:t>
             </w:r>
           </w:p>
         </w:tc>
@@ -1259,7 +1267,7 @@
                 <w:b w:val="0"/>
                 <w:sz w:val="18"/>
               </w:rPr>
-              <w:t>&gt;96%</w:t>
+              <w:t>&gt;95%</w:t>
             </w:r>
           </w:p>
         </w:tc>
@@ -1276,7 +1284,7 @@
                 <w:b w:val="0"/>
                 <w:sz w:val="18"/>
               </w:rPr>
-              <w:t>Cartridge lifetime</w:t>
+              <w:t>Sachet lifetime</w:t>
             </w:r>
           </w:p>
         </w:tc>
@@ -1291,7 +1299,7 @@
                 <w:b w:val="0"/>
                 <w:sz w:val="18"/>
               </w:rPr>
-              <w:t>3-5 uses</w:t>
+              <w:t>2-3 uses</w:t>
             </w:r>
           </w:p>
         </w:tc>
@@ -1308,7 +1316,7 @@
                 <w:b w:val="0"/>
                 <w:sz w:val="18"/>
               </w:rPr>
-              <w:t>Cost per cartridge</w:t>
+              <w:t>Cost per sachet</w:t>
             </w:r>
           </w:p>
         </w:tc>
@@ -1323,7 +1331,7 @@
                 <w:b w:val="0"/>
                 <w:sz w:val="18"/>
               </w:rPr>
-              <w:t>200-400 JPY</w:t>
+              <w:t>100-200 JPY</w:t>
             </w:r>
           </w:p>
         </w:tc>
@@ -1335,7 +1343,7 @@
         <w:rPr>
           <w:sz w:val="22"/>
         </w:rPr>
-        <w:t>Several parameters merit discussion. First, the granulated format (0.8-1.5 mm) necessarily sacrifices some adsorption kinetics compared to industrial powder (&lt;0.1 mm), but the 2-5 minute gravity flow contact time is sufficient for meaningful AV and TPC reduction.</w:t>
+        <w:t>Several parameters merit discussion. First, the granulated format (0.3-0.5 mm) necessarily sacrifices some adsorption kinetics compared to industrial powder (&lt;0.1 mm), but the 15-30 minute immersion time compensates for the diffusion-limited mass transfer through the sachet membrane.</w:t>
       </w:r>
       <w:r>
         <w:rPr>
@@ -1348,7 +1356,7 @@
         <w:rPr>
           <w:sz w:val="22"/>
         </w:rPr>
-        <w:t xml:space="preserve"> Second, the recommended filtration temperature of 50-100 C balances oil viscosity (affecting flow rate) with adsorption thermodynamics (lower temperatures favor adsorption but increase viscosity).</w:t>
+        <w:t xml:space="preserve"> Second, the recommended immersion temperature of 50-80 C balances oil viscosity (affecting diffusion rate) with practical safety considerations.</w:t>
       </w:r>
       <w:r>
         <w:rPr>
@@ -1361,7 +1369,7 @@
         <w:rPr>
           <w:sz w:val="22"/>
         </w:rPr>
-        <w:t xml:space="preserve"> Third, cartridge longevity of 3-5 uses is projected based on industrial bleaching earth capacity data scaled to the consumer oil volume range.</w:t>
+        <w:t xml:space="preserve"> Third, sachet reuse for 2-3 sessions is projected based on industrial bleaching earth capacity data scaled to the consumer oil volume range.</w:t>
       </w:r>
       <w:r>
         <w:rPr>
@@ -1410,7 +1418,7 @@
         <w:rPr>
           <w:sz w:val="22"/>
         </w:rPr>
-        <w:t>The regulatory pathway for montmorillonite-based oil pot filters is straightforward, as bentonite is already approved as a food-contact material and processing aid across major jurisdictions.</w:t>
+        <w:t>The regulatory pathway for montmorillonite-based oil sachets is straightforward, as bentonite is already approved as a food-contact material and processing aid across major jurisdictions.</w:t>
       </w:r>
       <w:r>
         <w:rPr>
@@ -1456,7 +1464,7 @@
         <w:rPr>
           <w:sz w:val="22"/>
         </w:rPr>
-        <w:t>A key safety consideration is the potential for residual acid (from the activation process) or trace metals (inherent to the clay mineral) to leach into the oil during filtration. Industrial practice addresses this through thorough post-activation washing until the rinse water reaches neutral pH, followed by drying and quality testing (heavy metal content, acid residue).</w:t>
+        <w:t>A key safety consideration is the potential for residual acid (from the activation process) or trace metals (inherent to the clay mineral) to leach into the oil during immersion. Industrial practice addresses this through thorough post-activation washing until the rinse water reaches neutral pH, followed by drying and quality testing (heavy metal content, acid residue).</w:t>
       </w:r>
       <w:r>
         <w:rPr>
@@ -1469,7 +1477,7 @@
         <w:rPr>
           <w:sz w:val="22"/>
         </w:rPr>
-        <w:t xml:space="preserve"> The same quality controls would apply to consumer-format cartridges, with the additional advantage that the larger particle size (0.8-1.5 mm vs. &lt;0.1 mm powder) reduces the risk of particle shedding into the filtered oil.</w:t>
+        <w:t xml:space="preserve"> The same quality controls would apply to consumer sachets, with the additional advantage that the granulated format (0.3-0.5 mm) is retained within the sachet membrane, preventing direct particle contact with the end product.</w:t>
       </w:r>
     </w:p>
     <w:p>
@@ -1477,7 +1485,7 @@
         <w:rPr>
           <w:sz w:val="22"/>
         </w:rPr>
-        <w:t>From a product classification standpoint, the cartridge would likely be classified as a food-contact article (kitchenware) rather than a food additive, as the montmorillonite remains within the cartridge and does not become a component of the food.</w:t>
+        <w:t>From a product classification standpoint, the sachet would likely be classified as a food-contact article (kitchenware) rather than a food additive, as the montmorillonite remains within the sachet and does not become a component of the food.</w:t>
       </w:r>
       <w:r>
         <w:rPr>
@@ -1520,7 +1528,7 @@
         <w:rPr>
           <w:sz w:val="22"/>
         </w:rPr>
-        <w:t xml:space="preserve"> Oil pot filter cartridge manufacturing is similarly well-established, with existing production lines for activated carbon and paper cartridges that could be adapted for montmorillonite filling with minimal retooling.</w:t>
+        <w:t xml:space="preserve"> Sachet and tea-bag manufacturing is similarly well-established, with existing production lines for heat-resistant nonwoven sachets that could be adapted for montmorillonite filling with minimal retooling. Oil pot filter manufacturers already produce heat-resistant nonwoven components that provide the necessary membrane technology.</w:t>
       </w:r>
       <w:r>
         <w:rPr>
@@ -1540,7 +1548,7 @@
         <w:rPr>
           <w:sz w:val="22"/>
         </w:rPr>
-        <w:t>The economic proposition is favorable from both manufacturer and consumer perspectives. Montmorillonite raw material costs are low (approximately 100-300 JPY/kg for food-grade acid-activated product),</w:t>
+        <w:t>The economic proposition is favorable from both manufacturer and consumer perspectives. Montmorillonite raw material costs are approximately 300-500 JPY/kg for food-grade acid-activated product,</w:t>
       </w:r>
       <w:r>
         <w:rPr>
@@ -1553,7 +1561,7 @@
         <w:rPr>
           <w:sz w:val="22"/>
         </w:rPr>
-        <w:t xml:space="preserve"> translating to a material cost of 3-9 JPY per cartridge (30 g fill). Including packaging, assembly, and distribution, a consumer price of 200-400 JPY per cartridge (3-5 uses each) would yield margins comparable to existing oil pot filter products while offering substantially greater functionality.</w:t>
+        <w:t xml:space="preserve"> translating to a material cost of 8-13 JPY per sachet (25 g fill). Including packaging, assembly, and distribution, a consumer price of 100-200 JPY per sachet (2-3 uses each) would yield margins comparable to existing oil pot filter products while offering substantially greater functionality.</w:t>
       </w:r>
     </w:p>
     <w:p>
@@ -1561,7 +1569,7 @@
         <w:rPr>
           <w:sz w:val="22"/>
         </w:rPr>
-        <w:t>Consumer adoption may be facilitated by the familiarity of the oil pot format in Japanese households, where the practice of filtering and reusing cooking oil is culturally embedded.</w:t>
+        <w:t>Consumer adoption may be facilitated by the familiarity of the tea-bag format and the deeply embedded practice of oil reuse in Japanese households.</w:t>
       </w:r>
       <w:r>
         <w:rPr>
@@ -1574,7 +1582,7 @@
         <w:rPr>
           <w:sz w:val="22"/>
         </w:rPr>
-        <w:t xml:space="preserve"> The cartridge design -- a drop-in replacement for existing filter elements -- minimizes the behavioral change required for adoption.</w:t>
+        <w:t xml:space="preserve"> The sachet's simplicity -- immerse, wait, remove -- requires no new equipment and minimal behavioral change.</w:t>
       </w:r>
     </w:p>
     <w:p>
@@ -1591,7 +1599,7 @@
         <w:rPr>
           <w:sz w:val="22"/>
         </w:rPr>
-        <w:t>Several research directions could advance this concept toward commercialization. First, systematic bench-scale studies are needed to optimize acid activation conditions specifically for the granulated format (balancing surface area, mechanical strength, and particle integrity during oil flow). Second, consumer-oriented quality indicators -- such as colorimetric test strips for acid value or polar compound content -- would enhance the user experience and ensure safe oil reuse practices.</w:t>
+        <w:t>Several research directions could advance this concept toward commercialization. First, systematic bench-scale studies are needed to optimize acid activation conditions specifically for the granulated sachet format (balancing surface area, mechanical strength, and particle integrity during oil immersion). Second, consumer-oriented quality indicators -- such as colorimetric test strips for acid value or polar compound content -- would enhance the user experience and ensure safe oil reuse practices.</w:t>
       </w:r>
       <w:r>
         <w:rPr>
@@ -1604,7 +1612,7 @@
         <w:rPr>
           <w:sz w:val="22"/>
         </w:rPr>
-        <w:t xml:space="preserve"> Third, life-cycle assessment comparing the environmental footprint of extended oil reuse (with cartridge waste) versus more frequent oil replacement would quantify the sustainability benefits.</w:t>
+        <w:t xml:space="preserve"> Third, life-cycle assessment comparing the environmental footprint of extended oil reuse (with sachet waste) versus more frequent oil replacement would quantify the sustainability benefits.</w:t>
       </w:r>
     </w:p>
     <w:p>
@@ -1612,7 +1620,7 @@
         <w:rPr>
           <w:sz w:val="22"/>
         </w:rPr>
-        <w:t>In conclusion, the translation of bleaching earth technology from industrial oil refining to consumer oil pots represents a compelling opportunity. The science is established, the safety profile is documented, the manufacturing infrastructure exists, and the consumer need is clear. What remains is the engineering challenge of reformatting a century-old industrial technology into a cartridge that fits into the kitchen counter -- a challenge that, given the precedents in water filtration (activated carbon) and tea preparation (tea bags), appears eminently solvable.</w:t>
+        <w:t>In conclusion, the translation of bleaching earth technology from industrial oil refining to consumer-format sachets represents a compelling opportunity. The science is established, the safety profile is documented, the manufacturing infrastructure exists, and the consumer need is clear. What remains is the engineering challenge of reformatting a century-old industrial technology into a sachet that fits into the kitchen counter -- a challenge that, given the precedents in water filtration (activated carbon), tea preparation (tea bags), and our parallel proposal for decaffeination sachets, appears eminently solvable.</w:t>
       </w:r>
     </w:p>
     <w:p/>

</xml_diff>